<commit_message>
Add English/Swahili bilingual support across kiosk and staff portal
- Add Swahili columns to Department, Office, Service and Announcement models
- Localize public API responses via ?lang=sw (offices, services, departments, announcements, search)
- Seed real Swahili translations (npm run prisma:sync-translations)
- Add i18n framework (translations + LanguageContext + LanguageToggle) and convert all kiosk and staff UI strings
- Replace demo dev.db data with the real TRA Dodoma directory seed
- Apply proposal review edits to PROJECT PROPOSAL NEW.docx
</commit_message>
<xml_diff>
--- a/docs/PROJECT PROPOSAL NEW.docx
+++ b/docs/PROJECT PROPOSAL NEW.docx
@@ -3064,6 +3064,1658 @@
     </w:p>
     <w:p>
       <w:pPr>
+        <w:spacing w:after="120"/>
+      </w:pPr>
+      <w:r>
+        <w:rPr>
+          <w:b/>
+          <w:sz w:val="22"/>
+        </w:rPr>
+        <w:t>8.1.1 Role Permissions Matrix</w:t>
+      </w:r>
+    </w:p>
+    <w:p>
+      <w:pPr>
+        <w:spacing w:after="120"/>
+      </w:pPr>
+      <w:r>
+        <w:rPr>
+          <w:b w:val="0"/>
+          <w:sz w:val="22"/>
+        </w:rPr>
+        <w:t>The Administrator and Public roles are the two mandatory roles created at system installation. The Administrator has full control of users, permissions and configuration, while the Public role has no access to any internal registry function and exists only for the office directory, service guide, building map and announcements. All other roles operate on the least-privilege principle.</w:t>
+      </w:r>
+    </w:p>
+    <w:tbl>
+      <w:tblPr>
+        <w:tblW w:type="auto" w:w="0"/>
+        <w:tblLook w:firstColumn="1" w:firstRow="1" w:lastColumn="0" w:lastRow="0" w:noHBand="0" w:noVBand="1" w:val="04A0"/>
+        <w:tblBorders>
+          <w:top w:val="single" w:sz="4" w:space="0" w:color="000000"/>
+          <w:left w:val="single" w:sz="4" w:space="0" w:color="000000"/>
+          <w:bottom w:val="single" w:sz="4" w:space="0" w:color="000000"/>
+          <w:right w:val="single" w:sz="4" w:space="0" w:color="000000"/>
+          <w:insideH w:val="single" w:sz="4" w:space="0" w:color="000000"/>
+          <w:insideV w:val="single" w:sz="4" w:space="0" w:color="000000"/>
+        </w:tblBorders>
+      </w:tblPr>
+      <w:tblGrid>
+        <w:gridCol w:w="1170"/>
+        <w:gridCol w:w="1170"/>
+        <w:gridCol w:w="1170"/>
+        <w:gridCol w:w="1170"/>
+        <w:gridCol w:w="1170"/>
+        <w:gridCol w:w="1170"/>
+        <w:gridCol w:w="1170"/>
+        <w:gridCol w:w="1170"/>
+      </w:tblGrid>
+      <w:tr>
+        <w:tc>
+          <w:tcPr>
+            <w:tcW w:type="dxa" w:w="1170"/>
+          </w:tcPr>
+          <w:p>
+            <w:r/>
+            <w:r>
+              <w:rPr>
+                <w:b/>
+                <w:sz w:val="20"/>
+              </w:rPr>
+              <w:t>Action</w:t>
+            </w:r>
+          </w:p>
+        </w:tc>
+        <w:tc>
+          <w:tcPr>
+            <w:tcW w:type="dxa" w:w="1170"/>
+          </w:tcPr>
+          <w:p>
+            <w:r/>
+            <w:r>
+              <w:rPr>
+                <w:b/>
+                <w:sz w:val="20"/>
+              </w:rPr>
+              <w:t>Administrator</w:t>
+            </w:r>
+          </w:p>
+        </w:tc>
+        <w:tc>
+          <w:tcPr>
+            <w:tcW w:type="dxa" w:w="1170"/>
+          </w:tcPr>
+          <w:p>
+            <w:r/>
+            <w:r>
+              <w:rPr>
+                <w:b/>
+                <w:sz w:val="20"/>
+              </w:rPr>
+              <w:t>Registry Officer</w:t>
+            </w:r>
+          </w:p>
+        </w:tc>
+        <w:tc>
+          <w:tcPr>
+            <w:tcW w:type="dxa" w:w="1170"/>
+          </w:tcPr>
+          <w:p>
+            <w:r/>
+            <w:r>
+              <w:rPr>
+                <w:b/>
+                <w:sz w:val="20"/>
+              </w:rPr>
+              <w:t>Records Officer</w:t>
+            </w:r>
+          </w:p>
+        </w:tc>
+        <w:tc>
+          <w:tcPr>
+            <w:tcW w:type="dxa" w:w="1170"/>
+          </w:tcPr>
+          <w:p>
+            <w:r/>
+            <w:r>
+              <w:rPr>
+                <w:b/>
+                <w:sz w:val="20"/>
+              </w:rPr>
+              <w:t>Department Officer</w:t>
+            </w:r>
+          </w:p>
+        </w:tc>
+        <w:tc>
+          <w:tcPr>
+            <w:tcW w:type="dxa" w:w="1170"/>
+          </w:tcPr>
+          <w:p>
+            <w:r/>
+            <w:r>
+              <w:rPr>
+                <w:b/>
+                <w:sz w:val="20"/>
+              </w:rPr>
+              <w:t>Supervisor</w:t>
+            </w:r>
+          </w:p>
+        </w:tc>
+        <w:tc>
+          <w:tcPr>
+            <w:tcW w:type="dxa" w:w="1170"/>
+          </w:tcPr>
+          <w:p>
+            <w:r/>
+            <w:r>
+              <w:rPr>
+                <w:b/>
+                <w:sz w:val="20"/>
+              </w:rPr>
+              <w:t>Management</w:t>
+            </w:r>
+          </w:p>
+        </w:tc>
+        <w:tc>
+          <w:tcPr>
+            <w:tcW w:type="dxa" w:w="1170"/>
+          </w:tcPr>
+          <w:p>
+            <w:r/>
+            <w:r>
+              <w:rPr>
+                <w:b/>
+                <w:sz w:val="20"/>
+              </w:rPr>
+              <w:t>Public</w:t>
+            </w:r>
+          </w:p>
+        </w:tc>
+      </w:tr>
+      <w:tr>
+        <w:tc>
+          <w:tcPr>
+            <w:tcW w:type="dxa" w:w="1170"/>
+          </w:tcPr>
+          <w:p>
+            <w:r/>
+            <w:r>
+              <w:rPr>
+                <w:sz w:val="20"/>
+              </w:rPr>
+              <w:t>Register incoming documents</w:t>
+            </w:r>
+          </w:p>
+        </w:tc>
+        <w:tc>
+          <w:tcPr>
+            <w:tcW w:type="dxa" w:w="1170"/>
+          </w:tcPr>
+          <w:p>
+            <w:r/>
+            <w:r>
+              <w:rPr>
+                <w:sz w:val="20"/>
+              </w:rPr>
+              <w:t>✔</w:t>
+            </w:r>
+          </w:p>
+        </w:tc>
+        <w:tc>
+          <w:tcPr>
+            <w:tcW w:type="dxa" w:w="1170"/>
+          </w:tcPr>
+          <w:p>
+            <w:r/>
+            <w:r>
+              <w:rPr>
+                <w:sz w:val="20"/>
+              </w:rPr>
+              <w:t>✔</w:t>
+            </w:r>
+          </w:p>
+        </w:tc>
+        <w:tc>
+          <w:tcPr>
+            <w:tcW w:type="dxa" w:w="1170"/>
+          </w:tcPr>
+          <w:p>
+            <w:r/>
+            <w:r>
+              <w:rPr>
+                <w:sz w:val="20"/>
+              </w:rPr>
+              <w:t>✔</w:t>
+            </w:r>
+          </w:p>
+        </w:tc>
+        <w:tc>
+          <w:tcPr>
+            <w:tcW w:type="dxa" w:w="1170"/>
+          </w:tcPr>
+          <w:p>
+            <w:r/>
+            <w:r>
+              <w:rPr>
+                <w:sz w:val="20"/>
+              </w:rPr>
+              <w:t>–</w:t>
+            </w:r>
+          </w:p>
+        </w:tc>
+        <w:tc>
+          <w:tcPr>
+            <w:tcW w:type="dxa" w:w="1170"/>
+          </w:tcPr>
+          <w:p>
+            <w:r/>
+            <w:r>
+              <w:rPr>
+                <w:sz w:val="20"/>
+              </w:rPr>
+              <w:t>–</w:t>
+            </w:r>
+          </w:p>
+        </w:tc>
+        <w:tc>
+          <w:tcPr>
+            <w:tcW w:type="dxa" w:w="1170"/>
+          </w:tcPr>
+          <w:p>
+            <w:r/>
+            <w:r>
+              <w:rPr>
+                <w:sz w:val="20"/>
+              </w:rPr>
+              <w:t>–</w:t>
+            </w:r>
+          </w:p>
+        </w:tc>
+        <w:tc>
+          <w:tcPr>
+            <w:tcW w:type="dxa" w:w="1170"/>
+          </w:tcPr>
+          <w:p>
+            <w:r/>
+            <w:r>
+              <w:rPr>
+                <w:sz w:val="20"/>
+              </w:rPr>
+              <w:t>–</w:t>
+            </w:r>
+          </w:p>
+        </w:tc>
+      </w:tr>
+      <w:tr>
+        <w:tc>
+          <w:tcPr>
+            <w:tcW w:type="dxa" w:w="1170"/>
+          </w:tcPr>
+          <w:p>
+            <w:r/>
+            <w:r>
+              <w:rPr>
+                <w:sz w:val="20"/>
+              </w:rPr>
+              <w:t>Register outgoing documents</w:t>
+            </w:r>
+          </w:p>
+        </w:tc>
+        <w:tc>
+          <w:tcPr>
+            <w:tcW w:type="dxa" w:w="1170"/>
+          </w:tcPr>
+          <w:p>
+            <w:r/>
+            <w:r>
+              <w:rPr>
+                <w:sz w:val="20"/>
+              </w:rPr>
+              <w:t>✔</w:t>
+            </w:r>
+          </w:p>
+        </w:tc>
+        <w:tc>
+          <w:tcPr>
+            <w:tcW w:type="dxa" w:w="1170"/>
+          </w:tcPr>
+          <w:p>
+            <w:r/>
+            <w:r>
+              <w:rPr>
+                <w:sz w:val="20"/>
+              </w:rPr>
+              <w:t>✔</w:t>
+            </w:r>
+          </w:p>
+        </w:tc>
+        <w:tc>
+          <w:tcPr>
+            <w:tcW w:type="dxa" w:w="1170"/>
+          </w:tcPr>
+          <w:p>
+            <w:r/>
+            <w:r>
+              <w:rPr>
+                <w:sz w:val="20"/>
+              </w:rPr>
+              <w:t>✔</w:t>
+            </w:r>
+          </w:p>
+        </w:tc>
+        <w:tc>
+          <w:tcPr>
+            <w:tcW w:type="dxa" w:w="1170"/>
+          </w:tcPr>
+          <w:p>
+            <w:r/>
+            <w:r>
+              <w:rPr>
+                <w:sz w:val="20"/>
+              </w:rPr>
+              <w:t>–</w:t>
+            </w:r>
+          </w:p>
+        </w:tc>
+        <w:tc>
+          <w:tcPr>
+            <w:tcW w:type="dxa" w:w="1170"/>
+          </w:tcPr>
+          <w:p>
+            <w:r/>
+            <w:r>
+              <w:rPr>
+                <w:sz w:val="20"/>
+              </w:rPr>
+              <w:t>–</w:t>
+            </w:r>
+          </w:p>
+        </w:tc>
+        <w:tc>
+          <w:tcPr>
+            <w:tcW w:type="dxa" w:w="1170"/>
+          </w:tcPr>
+          <w:p>
+            <w:r/>
+            <w:r>
+              <w:rPr>
+                <w:sz w:val="20"/>
+              </w:rPr>
+              <w:t>–</w:t>
+            </w:r>
+          </w:p>
+        </w:tc>
+        <w:tc>
+          <w:tcPr>
+            <w:tcW w:type="dxa" w:w="1170"/>
+          </w:tcPr>
+          <w:p>
+            <w:r/>
+            <w:r>
+              <w:rPr>
+                <w:sz w:val="20"/>
+              </w:rPr>
+              <w:t>–</w:t>
+            </w:r>
+          </w:p>
+        </w:tc>
+      </w:tr>
+      <w:tr>
+        <w:tc>
+          <w:tcPr>
+            <w:tcW w:type="dxa" w:w="1170"/>
+          </w:tcPr>
+          <w:p>
+            <w:r/>
+            <w:r>
+              <w:rPr>
+                <w:sz w:val="20"/>
+              </w:rPr>
+              <w:t>Create outgoing documents</w:t>
+            </w:r>
+          </w:p>
+        </w:tc>
+        <w:tc>
+          <w:tcPr>
+            <w:tcW w:type="dxa" w:w="1170"/>
+          </w:tcPr>
+          <w:p>
+            <w:r/>
+            <w:r>
+              <w:rPr>
+                <w:sz w:val="20"/>
+              </w:rPr>
+              <w:t>✔</w:t>
+            </w:r>
+          </w:p>
+        </w:tc>
+        <w:tc>
+          <w:tcPr>
+            <w:tcW w:type="dxa" w:w="1170"/>
+          </w:tcPr>
+          <w:p>
+            <w:r/>
+            <w:r>
+              <w:rPr>
+                <w:sz w:val="20"/>
+              </w:rPr>
+              <w:t>–</w:t>
+            </w:r>
+          </w:p>
+        </w:tc>
+        <w:tc>
+          <w:tcPr>
+            <w:tcW w:type="dxa" w:w="1170"/>
+          </w:tcPr>
+          <w:p>
+            <w:r/>
+            <w:r>
+              <w:rPr>
+                <w:sz w:val="20"/>
+              </w:rPr>
+              <w:t>–</w:t>
+            </w:r>
+          </w:p>
+        </w:tc>
+        <w:tc>
+          <w:tcPr>
+            <w:tcW w:type="dxa" w:w="1170"/>
+          </w:tcPr>
+          <w:p>
+            <w:r/>
+            <w:r>
+              <w:rPr>
+                <w:sz w:val="20"/>
+              </w:rPr>
+              <w:t>✔</w:t>
+            </w:r>
+          </w:p>
+        </w:tc>
+        <w:tc>
+          <w:tcPr>
+            <w:tcW w:type="dxa" w:w="1170"/>
+          </w:tcPr>
+          <w:p>
+            <w:r/>
+            <w:r>
+              <w:rPr>
+                <w:sz w:val="20"/>
+              </w:rPr>
+              <w:t>–</w:t>
+            </w:r>
+          </w:p>
+        </w:tc>
+        <w:tc>
+          <w:tcPr>
+            <w:tcW w:type="dxa" w:w="1170"/>
+          </w:tcPr>
+          <w:p>
+            <w:r/>
+            <w:r>
+              <w:rPr>
+                <w:sz w:val="20"/>
+              </w:rPr>
+              <w:t>–</w:t>
+            </w:r>
+          </w:p>
+        </w:tc>
+        <w:tc>
+          <w:tcPr>
+            <w:tcW w:type="dxa" w:w="1170"/>
+          </w:tcPr>
+          <w:p>
+            <w:r/>
+            <w:r>
+              <w:rPr>
+                <w:sz w:val="20"/>
+              </w:rPr>
+              <w:t>–</w:t>
+            </w:r>
+          </w:p>
+        </w:tc>
+      </w:tr>
+      <w:tr>
+        <w:tc>
+          <w:tcPr>
+            <w:tcW w:type="dxa" w:w="1170"/>
+          </w:tcPr>
+          <w:p>
+            <w:r/>
+            <w:r>
+              <w:rPr>
+                <w:sz w:val="20"/>
+              </w:rPr>
+              <w:t>Approve documents for dispatch</w:t>
+            </w:r>
+          </w:p>
+        </w:tc>
+        <w:tc>
+          <w:tcPr>
+            <w:tcW w:type="dxa" w:w="1170"/>
+          </w:tcPr>
+          <w:p>
+            <w:r/>
+            <w:r>
+              <w:rPr>
+                <w:sz w:val="20"/>
+              </w:rPr>
+              <w:t>✔</w:t>
+            </w:r>
+          </w:p>
+        </w:tc>
+        <w:tc>
+          <w:tcPr>
+            <w:tcW w:type="dxa" w:w="1170"/>
+          </w:tcPr>
+          <w:p>
+            <w:r/>
+            <w:r>
+              <w:rPr>
+                <w:sz w:val="20"/>
+              </w:rPr>
+              <w:t>–</w:t>
+            </w:r>
+          </w:p>
+        </w:tc>
+        <w:tc>
+          <w:tcPr>
+            <w:tcW w:type="dxa" w:w="1170"/>
+          </w:tcPr>
+          <w:p>
+            <w:r/>
+            <w:r>
+              <w:rPr>
+                <w:sz w:val="20"/>
+              </w:rPr>
+              <w:t>–</w:t>
+            </w:r>
+          </w:p>
+        </w:tc>
+        <w:tc>
+          <w:tcPr>
+            <w:tcW w:type="dxa" w:w="1170"/>
+          </w:tcPr>
+          <w:p>
+            <w:r/>
+            <w:r>
+              <w:rPr>
+                <w:sz w:val="20"/>
+              </w:rPr>
+              <w:t>–</w:t>
+            </w:r>
+          </w:p>
+        </w:tc>
+        <w:tc>
+          <w:tcPr>
+            <w:tcW w:type="dxa" w:w="1170"/>
+          </w:tcPr>
+          <w:p>
+            <w:r/>
+            <w:r>
+              <w:rPr>
+                <w:sz w:val="20"/>
+              </w:rPr>
+              <w:t>✔</w:t>
+            </w:r>
+          </w:p>
+        </w:tc>
+        <w:tc>
+          <w:tcPr>
+            <w:tcW w:type="dxa" w:w="1170"/>
+          </w:tcPr>
+          <w:p>
+            <w:r/>
+            <w:r>
+              <w:rPr>
+                <w:sz w:val="20"/>
+              </w:rPr>
+              <w:t>✔</w:t>
+            </w:r>
+          </w:p>
+        </w:tc>
+        <w:tc>
+          <w:tcPr>
+            <w:tcW w:type="dxa" w:w="1170"/>
+          </w:tcPr>
+          <w:p>
+            <w:r/>
+            <w:r>
+              <w:rPr>
+                <w:sz w:val="20"/>
+              </w:rPr>
+              <w:t>–</w:t>
+            </w:r>
+          </w:p>
+        </w:tc>
+      </w:tr>
+      <w:tr>
+        <w:tc>
+          <w:tcPr>
+            <w:tcW w:type="dxa" w:w="1170"/>
+          </w:tcPr>
+          <w:p>
+            <w:r/>
+            <w:r>
+              <w:rPr>
+                <w:sz w:val="20"/>
+              </w:rPr>
+              <w:t>Assign documents to departments</w:t>
+            </w:r>
+          </w:p>
+        </w:tc>
+        <w:tc>
+          <w:tcPr>
+            <w:tcW w:type="dxa" w:w="1170"/>
+          </w:tcPr>
+          <w:p>
+            <w:r/>
+            <w:r>
+              <w:rPr>
+                <w:sz w:val="20"/>
+              </w:rPr>
+              <w:t>✔</w:t>
+            </w:r>
+          </w:p>
+        </w:tc>
+        <w:tc>
+          <w:tcPr>
+            <w:tcW w:type="dxa" w:w="1170"/>
+          </w:tcPr>
+          <w:p>
+            <w:r/>
+            <w:r>
+              <w:rPr>
+                <w:sz w:val="20"/>
+              </w:rPr>
+              <w:t>✔</w:t>
+            </w:r>
+          </w:p>
+        </w:tc>
+        <w:tc>
+          <w:tcPr>
+            <w:tcW w:type="dxa" w:w="1170"/>
+          </w:tcPr>
+          <w:p>
+            <w:r/>
+            <w:r>
+              <w:rPr>
+                <w:sz w:val="20"/>
+              </w:rPr>
+              <w:t>–</w:t>
+            </w:r>
+          </w:p>
+        </w:tc>
+        <w:tc>
+          <w:tcPr>
+            <w:tcW w:type="dxa" w:w="1170"/>
+          </w:tcPr>
+          <w:p>
+            <w:r/>
+            <w:r>
+              <w:rPr>
+                <w:sz w:val="20"/>
+              </w:rPr>
+              <w:t>–</w:t>
+            </w:r>
+          </w:p>
+        </w:tc>
+        <w:tc>
+          <w:tcPr>
+            <w:tcW w:type="dxa" w:w="1170"/>
+          </w:tcPr>
+          <w:p>
+            <w:r/>
+            <w:r>
+              <w:rPr>
+                <w:sz w:val="20"/>
+              </w:rPr>
+              <w:t>✔</w:t>
+            </w:r>
+          </w:p>
+        </w:tc>
+        <w:tc>
+          <w:tcPr>
+            <w:tcW w:type="dxa" w:w="1170"/>
+          </w:tcPr>
+          <w:p>
+            <w:r/>
+            <w:r>
+              <w:rPr>
+                <w:sz w:val="20"/>
+              </w:rPr>
+              <w:t>–</w:t>
+            </w:r>
+          </w:p>
+        </w:tc>
+        <w:tc>
+          <w:tcPr>
+            <w:tcW w:type="dxa" w:w="1170"/>
+          </w:tcPr>
+          <w:p>
+            <w:r/>
+            <w:r>
+              <w:rPr>
+                <w:sz w:val="20"/>
+              </w:rPr>
+              <w:t>–</w:t>
+            </w:r>
+          </w:p>
+        </w:tc>
+      </w:tr>
+      <w:tr>
+        <w:tc>
+          <w:tcPr>
+            <w:tcW w:type="dxa" w:w="1170"/>
+          </w:tcPr>
+          <w:p>
+            <w:r/>
+            <w:r>
+              <w:rPr>
+                <w:sz w:val="20"/>
+              </w:rPr>
+              <w:t>View internal/confidential records</w:t>
+            </w:r>
+          </w:p>
+        </w:tc>
+        <w:tc>
+          <w:tcPr>
+            <w:tcW w:type="dxa" w:w="1170"/>
+          </w:tcPr>
+          <w:p>
+            <w:r/>
+            <w:r>
+              <w:rPr>
+                <w:sz w:val="20"/>
+              </w:rPr>
+              <w:t>✔</w:t>
+            </w:r>
+          </w:p>
+        </w:tc>
+        <w:tc>
+          <w:tcPr>
+            <w:tcW w:type="dxa" w:w="1170"/>
+          </w:tcPr>
+          <w:p>
+            <w:r/>
+            <w:r>
+              <w:rPr>
+                <w:sz w:val="20"/>
+              </w:rPr>
+              <w:t>✔</w:t>
+            </w:r>
+          </w:p>
+        </w:tc>
+        <w:tc>
+          <w:tcPr>
+            <w:tcW w:type="dxa" w:w="1170"/>
+          </w:tcPr>
+          <w:p>
+            <w:r/>
+            <w:r>
+              <w:rPr>
+                <w:sz w:val="20"/>
+              </w:rPr>
+              <w:t>✔</w:t>
+            </w:r>
+          </w:p>
+        </w:tc>
+        <w:tc>
+          <w:tcPr>
+            <w:tcW w:type="dxa" w:w="1170"/>
+          </w:tcPr>
+          <w:p>
+            <w:r/>
+            <w:r>
+              <w:rPr>
+                <w:sz w:val="20"/>
+              </w:rPr>
+              <w:t>–</w:t>
+            </w:r>
+          </w:p>
+        </w:tc>
+        <w:tc>
+          <w:tcPr>
+            <w:tcW w:type="dxa" w:w="1170"/>
+          </w:tcPr>
+          <w:p>
+            <w:r/>
+            <w:r>
+              <w:rPr>
+                <w:sz w:val="20"/>
+              </w:rPr>
+              <w:t>✔</w:t>
+            </w:r>
+          </w:p>
+        </w:tc>
+        <w:tc>
+          <w:tcPr>
+            <w:tcW w:type="dxa" w:w="1170"/>
+          </w:tcPr>
+          <w:p>
+            <w:r/>
+            <w:r>
+              <w:rPr>
+                <w:sz w:val="20"/>
+              </w:rPr>
+              <w:t>✔</w:t>
+            </w:r>
+          </w:p>
+        </w:tc>
+        <w:tc>
+          <w:tcPr>
+            <w:tcW w:type="dxa" w:w="1170"/>
+          </w:tcPr>
+          <w:p>
+            <w:r/>
+            <w:r>
+              <w:rPr>
+                <w:sz w:val="20"/>
+              </w:rPr>
+              <w:t>–</w:t>
+            </w:r>
+          </w:p>
+        </w:tc>
+      </w:tr>
+      <w:tr>
+        <w:tc>
+          <w:tcPr>
+            <w:tcW w:type="dxa" w:w="1170"/>
+          </w:tcPr>
+          <w:p>
+            <w:r/>
+            <w:r>
+              <w:rPr>
+                <w:sz w:val="20"/>
+              </w:rPr>
+              <w:t>View audit logs</w:t>
+            </w:r>
+          </w:p>
+        </w:tc>
+        <w:tc>
+          <w:tcPr>
+            <w:tcW w:type="dxa" w:w="1170"/>
+          </w:tcPr>
+          <w:p>
+            <w:r/>
+            <w:r>
+              <w:rPr>
+                <w:sz w:val="20"/>
+              </w:rPr>
+              <w:t>✔</w:t>
+            </w:r>
+          </w:p>
+        </w:tc>
+        <w:tc>
+          <w:tcPr>
+            <w:tcW w:type="dxa" w:w="1170"/>
+          </w:tcPr>
+          <w:p>
+            <w:r/>
+            <w:r>
+              <w:rPr>
+                <w:sz w:val="20"/>
+              </w:rPr>
+              <w:t>✔</w:t>
+            </w:r>
+          </w:p>
+        </w:tc>
+        <w:tc>
+          <w:tcPr>
+            <w:tcW w:type="dxa" w:w="1170"/>
+          </w:tcPr>
+          <w:p>
+            <w:r/>
+            <w:r>
+              <w:rPr>
+                <w:sz w:val="20"/>
+              </w:rPr>
+              <w:t>–</w:t>
+            </w:r>
+          </w:p>
+        </w:tc>
+        <w:tc>
+          <w:tcPr>
+            <w:tcW w:type="dxa" w:w="1170"/>
+          </w:tcPr>
+          <w:p>
+            <w:r/>
+            <w:r>
+              <w:rPr>
+                <w:sz w:val="20"/>
+              </w:rPr>
+              <w:t>–</w:t>
+            </w:r>
+          </w:p>
+        </w:tc>
+        <w:tc>
+          <w:tcPr>
+            <w:tcW w:type="dxa" w:w="1170"/>
+          </w:tcPr>
+          <w:p>
+            <w:r/>
+            <w:r>
+              <w:rPr>
+                <w:sz w:val="20"/>
+              </w:rPr>
+              <w:t>✔</w:t>
+            </w:r>
+          </w:p>
+        </w:tc>
+        <w:tc>
+          <w:tcPr>
+            <w:tcW w:type="dxa" w:w="1170"/>
+          </w:tcPr>
+          <w:p>
+            <w:r/>
+            <w:r>
+              <w:rPr>
+                <w:sz w:val="20"/>
+              </w:rPr>
+              <w:t>–</w:t>
+            </w:r>
+          </w:p>
+        </w:tc>
+        <w:tc>
+          <w:tcPr>
+            <w:tcW w:type="dxa" w:w="1170"/>
+          </w:tcPr>
+          <w:p>
+            <w:r/>
+            <w:r>
+              <w:rPr>
+                <w:sz w:val="20"/>
+              </w:rPr>
+              <w:t>–</w:t>
+            </w:r>
+          </w:p>
+        </w:tc>
+      </w:tr>
+      <w:tr>
+        <w:tc>
+          <w:tcPr>
+            <w:tcW w:type="dxa" w:w="1170"/>
+          </w:tcPr>
+          <w:p>
+            <w:r/>
+            <w:r>
+              <w:rPr>
+                <w:sz w:val="20"/>
+              </w:rPr>
+              <w:t>Generate management reports</w:t>
+            </w:r>
+          </w:p>
+        </w:tc>
+        <w:tc>
+          <w:tcPr>
+            <w:tcW w:type="dxa" w:w="1170"/>
+          </w:tcPr>
+          <w:p>
+            <w:r/>
+            <w:r>
+              <w:rPr>
+                <w:sz w:val="20"/>
+              </w:rPr>
+              <w:t>✔</w:t>
+            </w:r>
+          </w:p>
+        </w:tc>
+        <w:tc>
+          <w:tcPr>
+            <w:tcW w:type="dxa" w:w="1170"/>
+          </w:tcPr>
+          <w:p>
+            <w:r/>
+            <w:r>
+              <w:rPr>
+                <w:sz w:val="20"/>
+              </w:rPr>
+              <w:t>–</w:t>
+            </w:r>
+          </w:p>
+        </w:tc>
+        <w:tc>
+          <w:tcPr>
+            <w:tcW w:type="dxa" w:w="1170"/>
+          </w:tcPr>
+          <w:p>
+            <w:r/>
+            <w:r>
+              <w:rPr>
+                <w:sz w:val="20"/>
+              </w:rPr>
+              <w:t>–</w:t>
+            </w:r>
+          </w:p>
+        </w:tc>
+        <w:tc>
+          <w:tcPr>
+            <w:tcW w:type="dxa" w:w="1170"/>
+          </w:tcPr>
+          <w:p>
+            <w:r/>
+            <w:r>
+              <w:rPr>
+                <w:sz w:val="20"/>
+              </w:rPr>
+              <w:t>–</w:t>
+            </w:r>
+          </w:p>
+        </w:tc>
+        <w:tc>
+          <w:tcPr>
+            <w:tcW w:type="dxa" w:w="1170"/>
+          </w:tcPr>
+          <w:p>
+            <w:r/>
+            <w:r>
+              <w:rPr>
+                <w:sz w:val="20"/>
+              </w:rPr>
+              <w:t>✔</w:t>
+            </w:r>
+          </w:p>
+        </w:tc>
+        <w:tc>
+          <w:tcPr>
+            <w:tcW w:type="dxa" w:w="1170"/>
+          </w:tcPr>
+          <w:p>
+            <w:r/>
+            <w:r>
+              <w:rPr>
+                <w:sz w:val="20"/>
+              </w:rPr>
+              <w:t>✔</w:t>
+            </w:r>
+          </w:p>
+        </w:tc>
+        <w:tc>
+          <w:tcPr>
+            <w:tcW w:type="dxa" w:w="1170"/>
+          </w:tcPr>
+          <w:p>
+            <w:r/>
+            <w:r>
+              <w:rPr>
+                <w:sz w:val="20"/>
+              </w:rPr>
+              <w:t>–</w:t>
+            </w:r>
+          </w:p>
+        </w:tc>
+      </w:tr>
+      <w:tr>
+        <w:tc>
+          <w:tcPr>
+            <w:tcW w:type="dxa" w:w="1170"/>
+          </w:tcPr>
+          <w:p>
+            <w:r/>
+            <w:r>
+              <w:rPr>
+                <w:sz w:val="20"/>
+              </w:rPr>
+              <w:t>Edit office directory/services</w:t>
+            </w:r>
+          </w:p>
+        </w:tc>
+        <w:tc>
+          <w:tcPr>
+            <w:tcW w:type="dxa" w:w="1170"/>
+          </w:tcPr>
+          <w:p>
+            <w:r/>
+            <w:r>
+              <w:rPr>
+                <w:sz w:val="20"/>
+              </w:rPr>
+              <w:t>✔</w:t>
+            </w:r>
+          </w:p>
+        </w:tc>
+        <w:tc>
+          <w:tcPr>
+            <w:tcW w:type="dxa" w:w="1170"/>
+          </w:tcPr>
+          <w:p>
+            <w:r/>
+            <w:r>
+              <w:rPr>
+                <w:sz w:val="20"/>
+              </w:rPr>
+              <w:t>–</w:t>
+            </w:r>
+          </w:p>
+        </w:tc>
+        <w:tc>
+          <w:tcPr>
+            <w:tcW w:type="dxa" w:w="1170"/>
+          </w:tcPr>
+          <w:p>
+            <w:r/>
+            <w:r>
+              <w:rPr>
+                <w:sz w:val="20"/>
+              </w:rPr>
+              <w:t>–</w:t>
+            </w:r>
+          </w:p>
+        </w:tc>
+        <w:tc>
+          <w:tcPr>
+            <w:tcW w:type="dxa" w:w="1170"/>
+          </w:tcPr>
+          <w:p>
+            <w:r/>
+            <w:r>
+              <w:rPr>
+                <w:sz w:val="20"/>
+              </w:rPr>
+              <w:t>–</w:t>
+            </w:r>
+          </w:p>
+        </w:tc>
+        <w:tc>
+          <w:tcPr>
+            <w:tcW w:type="dxa" w:w="1170"/>
+          </w:tcPr>
+          <w:p>
+            <w:r/>
+            <w:r>
+              <w:rPr>
+                <w:sz w:val="20"/>
+              </w:rPr>
+              <w:t>–</w:t>
+            </w:r>
+          </w:p>
+        </w:tc>
+        <w:tc>
+          <w:tcPr>
+            <w:tcW w:type="dxa" w:w="1170"/>
+          </w:tcPr>
+          <w:p>
+            <w:r/>
+            <w:r>
+              <w:rPr>
+                <w:sz w:val="20"/>
+              </w:rPr>
+              <w:t>–</w:t>
+            </w:r>
+          </w:p>
+        </w:tc>
+        <w:tc>
+          <w:tcPr>
+            <w:tcW w:type="dxa" w:w="1170"/>
+          </w:tcPr>
+          <w:p>
+            <w:r/>
+            <w:r>
+              <w:rPr>
+                <w:sz w:val="20"/>
+              </w:rPr>
+              <w:t>–</w:t>
+            </w:r>
+          </w:p>
+        </w:tc>
+      </w:tr>
+      <w:tr>
+        <w:tc>
+          <w:tcPr>
+            <w:tcW w:type="dxa" w:w="1170"/>
+          </w:tcPr>
+          <w:p>
+            <w:r/>
+            <w:r>
+              <w:rPr>
+                <w:sz w:val="20"/>
+              </w:rPr>
+              <w:t>Manage users, roles and passwords</w:t>
+            </w:r>
+          </w:p>
+        </w:tc>
+        <w:tc>
+          <w:tcPr>
+            <w:tcW w:type="dxa" w:w="1170"/>
+          </w:tcPr>
+          <w:p>
+            <w:r/>
+            <w:r>
+              <w:rPr>
+                <w:sz w:val="20"/>
+              </w:rPr>
+              <w:t>✔</w:t>
+            </w:r>
+          </w:p>
+        </w:tc>
+        <w:tc>
+          <w:tcPr>
+            <w:tcW w:type="dxa" w:w="1170"/>
+          </w:tcPr>
+          <w:p>
+            <w:r/>
+            <w:r>
+              <w:rPr>
+                <w:sz w:val="20"/>
+              </w:rPr>
+              <w:t>–</w:t>
+            </w:r>
+          </w:p>
+        </w:tc>
+        <w:tc>
+          <w:tcPr>
+            <w:tcW w:type="dxa" w:w="1170"/>
+          </w:tcPr>
+          <w:p>
+            <w:r/>
+            <w:r>
+              <w:rPr>
+                <w:sz w:val="20"/>
+              </w:rPr>
+              <w:t>–</w:t>
+            </w:r>
+          </w:p>
+        </w:tc>
+        <w:tc>
+          <w:tcPr>
+            <w:tcW w:type="dxa" w:w="1170"/>
+          </w:tcPr>
+          <w:p>
+            <w:r/>
+            <w:r>
+              <w:rPr>
+                <w:sz w:val="20"/>
+              </w:rPr>
+              <w:t>–</w:t>
+            </w:r>
+          </w:p>
+        </w:tc>
+        <w:tc>
+          <w:tcPr>
+            <w:tcW w:type="dxa" w:w="1170"/>
+          </w:tcPr>
+          <w:p>
+            <w:r/>
+            <w:r>
+              <w:rPr>
+                <w:sz w:val="20"/>
+              </w:rPr>
+              <w:t>–</w:t>
+            </w:r>
+          </w:p>
+        </w:tc>
+        <w:tc>
+          <w:tcPr>
+            <w:tcW w:type="dxa" w:w="1170"/>
+          </w:tcPr>
+          <w:p>
+            <w:r/>
+            <w:r>
+              <w:rPr>
+                <w:sz w:val="20"/>
+              </w:rPr>
+              <w:t>–</w:t>
+            </w:r>
+          </w:p>
+        </w:tc>
+        <w:tc>
+          <w:tcPr>
+            <w:tcW w:type="dxa" w:w="1170"/>
+          </w:tcPr>
+          <w:p>
+            <w:r/>
+            <w:r>
+              <w:rPr>
+                <w:sz w:val="20"/>
+              </w:rPr>
+              <w:t>–</w:t>
+            </w:r>
+          </w:p>
+        </w:tc>
+      </w:tr>
+      <w:tr>
+        <w:tc>
+          <w:tcPr>
+            <w:tcW w:type="dxa" w:w="1170"/>
+          </w:tcPr>
+          <w:p>
+            <w:r/>
+            <w:r>
+              <w:rPr>
+                <w:sz w:val="20"/>
+              </w:rPr>
+              <w:t>Delete records permanently</w:t>
+            </w:r>
+          </w:p>
+        </w:tc>
+        <w:tc>
+          <w:tcPr>
+            <w:tcW w:type="dxa" w:w="1170"/>
+          </w:tcPr>
+          <w:p>
+            <w:r/>
+            <w:r>
+              <w:rPr>
+                <w:sz w:val="20"/>
+              </w:rPr>
+              <w:t>✔</w:t>
+            </w:r>
+          </w:p>
+        </w:tc>
+        <w:tc>
+          <w:tcPr>
+            <w:tcW w:type="dxa" w:w="1170"/>
+          </w:tcPr>
+          <w:p>
+            <w:r/>
+            <w:r>
+              <w:rPr>
+                <w:sz w:val="20"/>
+              </w:rPr>
+              <w:t>–</w:t>
+            </w:r>
+          </w:p>
+        </w:tc>
+        <w:tc>
+          <w:tcPr>
+            <w:tcW w:type="dxa" w:w="1170"/>
+          </w:tcPr>
+          <w:p>
+            <w:r/>
+            <w:r>
+              <w:rPr>
+                <w:sz w:val="20"/>
+              </w:rPr>
+              <w:t>–</w:t>
+            </w:r>
+          </w:p>
+        </w:tc>
+        <w:tc>
+          <w:tcPr>
+            <w:tcW w:type="dxa" w:w="1170"/>
+          </w:tcPr>
+          <w:p>
+            <w:r/>
+            <w:r>
+              <w:rPr>
+                <w:sz w:val="20"/>
+              </w:rPr>
+              <w:t>–</w:t>
+            </w:r>
+          </w:p>
+        </w:tc>
+        <w:tc>
+          <w:tcPr>
+            <w:tcW w:type="dxa" w:w="1170"/>
+          </w:tcPr>
+          <w:p>
+            <w:r/>
+            <w:r>
+              <w:rPr>
+                <w:sz w:val="20"/>
+              </w:rPr>
+              <w:t>–</w:t>
+            </w:r>
+          </w:p>
+        </w:tc>
+        <w:tc>
+          <w:tcPr>
+            <w:tcW w:type="dxa" w:w="1170"/>
+          </w:tcPr>
+          <w:p>
+            <w:r/>
+            <w:r>
+              <w:rPr>
+                <w:sz w:val="20"/>
+              </w:rPr>
+              <w:t>–</w:t>
+            </w:r>
+          </w:p>
+        </w:tc>
+        <w:tc>
+          <w:tcPr>
+            <w:tcW w:type="dxa" w:w="1170"/>
+          </w:tcPr>
+          <w:p>
+            <w:r/>
+            <w:r>
+              <w:rPr>
+                <w:sz w:val="20"/>
+              </w:rPr>
+              <w:t>–</w:t>
+            </w:r>
+          </w:p>
+        </w:tc>
+      </w:tr>
+      <w:tr>
+        <w:tc>
+          <w:tcPr>
+            <w:tcW w:type="dxa" w:w="1170"/>
+          </w:tcPr>
+          <w:p>
+            <w:r/>
+            <w:r>
+              <w:rPr>
+                <w:sz w:val="20"/>
+              </w:rPr>
+              <w:t>Search public office/service directory</w:t>
+            </w:r>
+          </w:p>
+        </w:tc>
+        <w:tc>
+          <w:tcPr>
+            <w:tcW w:type="dxa" w:w="1170"/>
+          </w:tcPr>
+          <w:p>
+            <w:r/>
+            <w:r>
+              <w:rPr>
+                <w:sz w:val="20"/>
+              </w:rPr>
+              <w:t>✔</w:t>
+            </w:r>
+          </w:p>
+        </w:tc>
+        <w:tc>
+          <w:tcPr>
+            <w:tcW w:type="dxa" w:w="1170"/>
+          </w:tcPr>
+          <w:p>
+            <w:r/>
+            <w:r>
+              <w:rPr>
+                <w:sz w:val="20"/>
+              </w:rPr>
+              <w:t>✔</w:t>
+            </w:r>
+          </w:p>
+        </w:tc>
+        <w:tc>
+          <w:tcPr>
+            <w:tcW w:type="dxa" w:w="1170"/>
+          </w:tcPr>
+          <w:p>
+            <w:r/>
+            <w:r>
+              <w:rPr>
+                <w:sz w:val="20"/>
+              </w:rPr>
+              <w:t>✔</w:t>
+            </w:r>
+          </w:p>
+        </w:tc>
+        <w:tc>
+          <w:tcPr>
+            <w:tcW w:type="dxa" w:w="1170"/>
+          </w:tcPr>
+          <w:p>
+            <w:r/>
+            <w:r>
+              <w:rPr>
+                <w:sz w:val="20"/>
+              </w:rPr>
+              <w:t>✔</w:t>
+            </w:r>
+          </w:p>
+        </w:tc>
+        <w:tc>
+          <w:tcPr>
+            <w:tcW w:type="dxa" w:w="1170"/>
+          </w:tcPr>
+          <w:p>
+            <w:r/>
+            <w:r>
+              <w:rPr>
+                <w:sz w:val="20"/>
+              </w:rPr>
+              <w:t>✔</w:t>
+            </w:r>
+          </w:p>
+        </w:tc>
+        <w:tc>
+          <w:tcPr>
+            <w:tcW w:type="dxa" w:w="1170"/>
+          </w:tcPr>
+          <w:p>
+            <w:r/>
+            <w:r>
+              <w:rPr>
+                <w:sz w:val="20"/>
+              </w:rPr>
+              <w:t>✔</w:t>
+            </w:r>
+          </w:p>
+        </w:tc>
+        <w:tc>
+          <w:tcPr>
+            <w:tcW w:type="dxa" w:w="1170"/>
+          </w:tcPr>
+          <w:p>
+            <w:r/>
+            <w:r>
+              <w:rPr>
+                <w:sz w:val="20"/>
+              </w:rPr>
+              <w:t>✔</w:t>
+            </w:r>
+          </w:p>
+        </w:tc>
+      </w:tr>
+      <w:tr>
+        <w:tc>
+          <w:tcPr>
+            <w:tcW w:type="dxa" w:w="1170"/>
+          </w:tcPr>
+          <w:p>
+            <w:r/>
+            <w:r>
+              <w:rPr>
+                <w:sz w:val="20"/>
+              </w:rPr>
+              <w:t>Scan QR / access public information</w:t>
+            </w:r>
+          </w:p>
+        </w:tc>
+        <w:tc>
+          <w:tcPr>
+            <w:tcW w:type="dxa" w:w="1170"/>
+          </w:tcPr>
+          <w:p>
+            <w:r/>
+            <w:r>
+              <w:rPr>
+                <w:sz w:val="20"/>
+              </w:rPr>
+              <w:t>✔</w:t>
+            </w:r>
+          </w:p>
+        </w:tc>
+        <w:tc>
+          <w:tcPr>
+            <w:tcW w:type="dxa" w:w="1170"/>
+          </w:tcPr>
+          <w:p>
+            <w:r/>
+            <w:r>
+              <w:rPr>
+                <w:sz w:val="20"/>
+              </w:rPr>
+              <w:t>✔</w:t>
+            </w:r>
+          </w:p>
+        </w:tc>
+        <w:tc>
+          <w:tcPr>
+            <w:tcW w:type="dxa" w:w="1170"/>
+          </w:tcPr>
+          <w:p>
+            <w:r/>
+            <w:r>
+              <w:rPr>
+                <w:sz w:val="20"/>
+              </w:rPr>
+              <w:t>✔</w:t>
+            </w:r>
+          </w:p>
+        </w:tc>
+        <w:tc>
+          <w:tcPr>
+            <w:tcW w:type="dxa" w:w="1170"/>
+          </w:tcPr>
+          <w:p>
+            <w:r/>
+            <w:r>
+              <w:rPr>
+                <w:sz w:val="20"/>
+              </w:rPr>
+              <w:t>✔</w:t>
+            </w:r>
+          </w:p>
+        </w:tc>
+        <w:tc>
+          <w:tcPr>
+            <w:tcW w:type="dxa" w:w="1170"/>
+          </w:tcPr>
+          <w:p>
+            <w:r/>
+            <w:r>
+              <w:rPr>
+                <w:sz w:val="20"/>
+              </w:rPr>
+              <w:t>✔</w:t>
+            </w:r>
+          </w:p>
+        </w:tc>
+        <w:tc>
+          <w:tcPr>
+            <w:tcW w:type="dxa" w:w="1170"/>
+          </w:tcPr>
+          <w:p>
+            <w:r/>
+            <w:r>
+              <w:rPr>
+                <w:sz w:val="20"/>
+              </w:rPr>
+              <w:t>✔</w:t>
+            </w:r>
+          </w:p>
+        </w:tc>
+        <w:tc>
+          <w:tcPr>
+            <w:tcW w:type="dxa" w:w="1170"/>
+          </w:tcPr>
+          <w:p>
+            <w:r/>
+            <w:r>
+              <w:rPr>
+                <w:sz w:val="20"/>
+              </w:rPr>
+              <w:t>✔</w:t>
+            </w:r>
+          </w:p>
+        </w:tc>
+      </w:tr>
+    </w:tbl>
+    <w:p>
+      <w:pPr>
         <w:rPr>
           <w:rFonts w:ascii="Times New Roman" w:hAnsi="Times New Roman" w:cs="Times New Roman"/>
           <w:b/>
@@ -4395,6 +6047,102 @@
     </w:p>
     <w:p>
       <w:pPr>
+        <w:spacing w:after="120"/>
+      </w:pPr>
+      <w:r>
+        <w:rPr>
+          <w:b/>
+          <w:sz w:val="22"/>
+        </w:rPr>
+        <w:t>QR code approach</w:t>
+      </w:r>
+    </w:p>
+    <w:p>
+      <w:pPr>
+        <w:spacing w:after="120"/>
+      </w:pPr>
+      <w:r>
+        <w:rPr>
+          <w:b w:val="0"/>
+          <w:sz w:val="22"/>
+        </w:rPr>
+        <w:t>QR codes link to a responsive public web page (no mobile application installation required) that shows the office directory, service guide, building map and announcements on the visitor’s smartphone.</w:t>
+      </w:r>
+    </w:p>
+    <w:p>
+      <w:pPr>
+        <w:spacing w:after="120"/>
+      </w:pPr>
+      <w:r>
+        <w:rPr>
+          <w:b/>
+          <w:sz w:val="22"/>
+        </w:rPr>
+        <w:t>Public screen accessibility requirements</w:t>
+      </w:r>
+    </w:p>
+    <w:p>
+      <w:pPr>
+        <w:spacing w:after="120"/>
+      </w:pPr>
+      <w:r>
+        <w:rPr>
+          <w:b w:val="0"/>
+          <w:sz w:val="22"/>
+        </w:rPr>
+        <w:t>English and Kiswahili language toggle on the home screen.</w:t>
+      </w:r>
+    </w:p>
+    <w:p>
+      <w:pPr>
+        <w:spacing w:after="120"/>
+      </w:pPr>
+      <w:r>
+        <w:rPr>
+          <w:b w:val="0"/>
+          <w:sz w:val="22"/>
+        </w:rPr>
+        <w:t>Large touch targets (minimum 48 px) and a simplified layout for low literacy.</w:t>
+      </w:r>
+    </w:p>
+    <w:p>
+      <w:pPr>
+        <w:spacing w:after="120"/>
+      </w:pPr>
+      <w:r>
+        <w:rPr>
+          <w:b w:val="0"/>
+          <w:sz w:val="22"/>
+        </w:rPr>
+        <w:t>High-contrast mode for visually impaired users.</w:t>
+      </w:r>
+    </w:p>
+    <w:p>
+      <w:pPr>
+        <w:spacing w:after="120"/>
+      </w:pPr>
+      <w:r>
+        <w:rPr>
+          <w:b w:val="0"/>
+          <w:sz w:val="22"/>
+        </w:rPr>
+        <w:t>Text-to-speech / read-aloud option.</w:t>
+      </w:r>
+    </w:p>
+    <w:p>
+      <w:pPr>
+        <w:spacing w:after="120"/>
+      </w:pPr>
+      <w:r>
+        <w:rPr>
+          <w:b w:val="0"/>
+          <w:sz w:val="22"/>
+        </w:rPr>
+        <w:t>Wheelchair-accessible route highlighted on the building map; lifts and emergency exits always shown.</w:t>
+      </w:r>
+    </w:p>
+    <w:p>
+      <w:pPr>
         <w:rPr>
           <w:rFonts w:ascii="Times New Roman" w:hAnsi="Times New Roman" w:cs="Times New Roman"/>
           <w:b/>
@@ -7513,6 +9261,404 @@
     </w:p>
     <w:p>
       <w:pPr>
+        <w:spacing w:after="120"/>
+      </w:pPr>
+      <w:r>
+        <w:rPr>
+          <w:b/>
+          <w:sz w:val="22"/>
+        </w:rPr>
+        <w:t>13.1 Specific Security Controls</w:t>
+      </w:r>
+    </w:p>
+    <w:p>
+      <w:pPr>
+        <w:spacing w:after="120"/>
+      </w:pPr>
+      <w:r>
+        <w:rPr>
+          <w:b w:val="0"/>
+          <w:sz w:val="22"/>
+        </w:rPr>
+        <w:t>The following concrete controls shall be implemented so that the requirements above are enforceable:</w:t>
+      </w:r>
+    </w:p>
+    <w:tbl>
+      <w:tblPr>
+        <w:tblW w:type="auto" w:w="0"/>
+        <w:tblLook w:firstColumn="1" w:firstRow="1" w:lastColumn="0" w:lastRow="0" w:noHBand="0" w:noVBand="1" w:val="04A0"/>
+        <w:tblBorders>
+          <w:top w:val="single" w:sz="4" w:space="0" w:color="000000"/>
+          <w:left w:val="single" w:sz="4" w:space="0" w:color="000000"/>
+          <w:bottom w:val="single" w:sz="4" w:space="0" w:color="000000"/>
+          <w:right w:val="single" w:sz="4" w:space="0" w:color="000000"/>
+          <w:insideH w:val="single" w:sz="4" w:space="0" w:color="000000"/>
+          <w:insideV w:val="single" w:sz="4" w:space="0" w:color="000000"/>
+        </w:tblBorders>
+      </w:tblPr>
+      <w:tblGrid>
+        <w:gridCol w:w="4680"/>
+        <w:gridCol w:w="4680"/>
+      </w:tblGrid>
+      <w:tr>
+        <w:tc>
+          <w:tcPr>
+            <w:tcW w:type="dxa" w:w="4680"/>
+          </w:tcPr>
+          <w:p>
+            <w:r/>
+            <w:r>
+              <w:rPr>
+                <w:b/>
+                <w:sz w:val="20"/>
+              </w:rPr>
+              <w:t>Control</w:t>
+            </w:r>
+          </w:p>
+        </w:tc>
+        <w:tc>
+          <w:tcPr>
+            <w:tcW w:type="dxa" w:w="4680"/>
+          </w:tcPr>
+          <w:p>
+            <w:r/>
+            <w:r>
+              <w:rPr>
+                <w:b/>
+                <w:sz w:val="20"/>
+              </w:rPr>
+              <w:t>Requirement</w:t>
+            </w:r>
+          </w:p>
+        </w:tc>
+      </w:tr>
+      <w:tr>
+        <w:tc>
+          <w:tcPr>
+            <w:tcW w:type="dxa" w:w="4680"/>
+          </w:tcPr>
+          <w:p>
+            <w:r/>
+            <w:r>
+              <w:rPr>
+                <w:sz w:val="20"/>
+              </w:rPr>
+              <w:t>Encryption at rest</w:t>
+            </w:r>
+          </w:p>
+        </w:tc>
+        <w:tc>
+          <w:tcPr>
+            <w:tcW w:type="dxa" w:w="4680"/>
+          </w:tcPr>
+          <w:p>
+            <w:r/>
+            <w:r>
+              <w:rPr>
+                <w:sz w:val="20"/>
+              </w:rPr>
+              <w:t>AES-256 for the database and stored scanned documents</w:t>
+            </w:r>
+          </w:p>
+        </w:tc>
+      </w:tr>
+      <w:tr>
+        <w:tc>
+          <w:tcPr>
+            <w:tcW w:type="dxa" w:w="4680"/>
+          </w:tcPr>
+          <w:p>
+            <w:r/>
+            <w:r>
+              <w:rPr>
+                <w:sz w:val="20"/>
+              </w:rPr>
+              <w:t>Encryption in transit</w:t>
+            </w:r>
+          </w:p>
+        </w:tc>
+        <w:tc>
+          <w:tcPr>
+            <w:tcW w:type="dxa" w:w="4680"/>
+          </w:tcPr>
+          <w:p>
+            <w:r/>
+            <w:r>
+              <w:rPr>
+                <w:sz w:val="20"/>
+              </w:rPr>
+              <w:t>TLS 1.2 or higher on all web and API traffic</w:t>
+            </w:r>
+          </w:p>
+        </w:tc>
+      </w:tr>
+      <w:tr>
+        <w:tc>
+          <w:tcPr>
+            <w:tcW w:type="dxa" w:w="4680"/>
+          </w:tcPr>
+          <w:p>
+            <w:r/>
+            <w:r>
+              <w:rPr>
+                <w:sz w:val="20"/>
+              </w:rPr>
+              <w:t>Authentication</w:t>
+            </w:r>
+          </w:p>
+        </w:tc>
+        <w:tc>
+          <w:tcPr>
+            <w:tcW w:type="dxa" w:w="4680"/>
+          </w:tcPr>
+          <w:p>
+            <w:r/>
+            <w:r>
+              <w:rPr>
+                <w:sz w:val="20"/>
+              </w:rPr>
+              <w:t>Multi-factor authentication (MFA) for Administrator, Registry Officer and Supervisor accounts</w:t>
+            </w:r>
+          </w:p>
+        </w:tc>
+      </w:tr>
+      <w:tr>
+        <w:tc>
+          <w:tcPr>
+            <w:tcW w:type="dxa" w:w="4680"/>
+          </w:tcPr>
+          <w:p>
+            <w:r/>
+            <w:r>
+              <w:rPr>
+                <w:sz w:val="20"/>
+              </w:rPr>
+              <w:t>Password policy</w:t>
+            </w:r>
+          </w:p>
+        </w:tc>
+        <w:tc>
+          <w:tcPr>
+            <w:tcW w:type="dxa" w:w="4680"/>
+          </w:tcPr>
+          <w:p>
+            <w:r/>
+            <w:r>
+              <w:rPr>
+                <w:sz w:val="20"/>
+              </w:rPr>
+              <w:t>Minimum 12 characters, change every 90 days, account lockout after 5 failed attempts</w:t>
+            </w:r>
+          </w:p>
+        </w:tc>
+      </w:tr>
+      <w:tr>
+        <w:tc>
+          <w:tcPr>
+            <w:tcW w:type="dxa" w:w="4680"/>
+          </w:tcPr>
+          <w:p>
+            <w:r/>
+            <w:r>
+              <w:rPr>
+                <w:sz w:val="20"/>
+              </w:rPr>
+              <w:t>Session control</w:t>
+            </w:r>
+          </w:p>
+        </w:tc>
+        <w:tc>
+          <w:tcPr>
+            <w:tcW w:type="dxa" w:w="4680"/>
+          </w:tcPr>
+          <w:p>
+            <w:r/>
+            <w:r>
+              <w:rPr>
+                <w:sz w:val="20"/>
+              </w:rPr>
+              <w:t>Automatic logout after 15 minutes of inactivity</w:t>
+            </w:r>
+          </w:p>
+        </w:tc>
+      </w:tr>
+      <w:tr>
+        <w:tc>
+          <w:tcPr>
+            <w:tcW w:type="dxa" w:w="4680"/>
+          </w:tcPr>
+          <w:p>
+            <w:r/>
+            <w:r>
+              <w:rPr>
+                <w:sz w:val="20"/>
+              </w:rPr>
+              <w:t>Backups</w:t>
+            </w:r>
+          </w:p>
+        </w:tc>
+        <w:tc>
+          <w:tcPr>
+            <w:tcW w:type="dxa" w:w="4680"/>
+          </w:tcPr>
+          <w:p>
+            <w:r/>
+            <w:r>
+              <w:rPr>
+                <w:sz w:val="20"/>
+              </w:rPr>
+              <w:t>Daily on-site and weekly off-site backups; recovery time objective of ≤ 24 hours</w:t>
+            </w:r>
+          </w:p>
+        </w:tc>
+      </w:tr>
+      <w:tr>
+        <w:tc>
+          <w:tcPr>
+            <w:tcW w:type="dxa" w:w="4680"/>
+          </w:tcPr>
+          <w:p>
+            <w:r/>
+            <w:r>
+              <w:rPr>
+                <w:sz w:val="20"/>
+              </w:rPr>
+              <w:t>Audit trail</w:t>
+            </w:r>
+          </w:p>
+        </w:tc>
+        <w:tc>
+          <w:tcPr>
+            <w:tcW w:type="dxa" w:w="4680"/>
+          </w:tcPr>
+          <w:p>
+            <w:r/>
+            <w:r>
+              <w:rPr>
+                <w:sz w:val="20"/>
+              </w:rPr>
+              <w:t>Immutable activity log that no user can edit or delete</w:t>
+            </w:r>
+          </w:p>
+        </w:tc>
+      </w:tr>
+      <w:tr>
+        <w:tc>
+          <w:tcPr>
+            <w:tcW w:type="dxa" w:w="4680"/>
+          </w:tcPr>
+          <w:p>
+            <w:r/>
+            <w:r>
+              <w:rPr>
+                <w:sz w:val="20"/>
+              </w:rPr>
+              <w:t>Confidential records</w:t>
+            </w:r>
+          </w:p>
+        </w:tc>
+        <w:tc>
+          <w:tcPr>
+            <w:tcW w:type="dxa" w:w="4680"/>
+          </w:tcPr>
+          <w:p>
+            <w:r/>
+            <w:r>
+              <w:rPr>
+                <w:sz w:val="20"/>
+              </w:rPr>
+              <w:t>Visible only to authorized internal roles; the Public role never receives access</w:t>
+            </w:r>
+          </w:p>
+        </w:tc>
+      </w:tr>
+      <w:tr>
+        <w:tc>
+          <w:tcPr>
+            <w:tcW w:type="dxa" w:w="4680"/>
+          </w:tcPr>
+          <w:p>
+            <w:r/>
+            <w:r>
+              <w:rPr>
+                <w:sz w:val="20"/>
+              </w:rPr>
+              <w:t>Antivirus/EDR</w:t>
+            </w:r>
+          </w:p>
+        </w:tc>
+        <w:tc>
+          <w:tcPr>
+            <w:tcW w:type="dxa" w:w="4680"/>
+          </w:tcPr>
+          <w:p>
+            <w:r/>
+            <w:r>
+              <w:rPr>
+                <w:sz w:val="20"/>
+              </w:rPr>
+              <w:t>Maintained on all servers and staff workstations</w:t>
+            </w:r>
+          </w:p>
+        </w:tc>
+      </w:tr>
+      <w:tr>
+        <w:tc>
+          <w:tcPr>
+            <w:tcW w:type="dxa" w:w="4680"/>
+          </w:tcPr>
+          <w:p>
+            <w:r/>
+            <w:r>
+              <w:rPr>
+                <w:sz w:val="20"/>
+              </w:rPr>
+              <w:t>Disaster recovery</w:t>
+            </w:r>
+          </w:p>
+        </w:tc>
+        <w:tc>
+          <w:tcPr>
+            <w:tcW w:type="dxa" w:w="4680"/>
+          </w:tcPr>
+          <w:p>
+            <w:r/>
+            <w:r>
+              <w:rPr>
+                <w:sz w:val="20"/>
+              </w:rPr>
+              <w:t>Documented recovery plan tested at least once per year</w:t>
+            </w:r>
+          </w:p>
+        </w:tc>
+      </w:tr>
+    </w:tbl>
+    <w:p>
+      <w:pPr>
+        <w:spacing w:after="120"/>
+      </w:pPr>
+      <w:r>
+        <w:rPr>
+          <w:b/>
+          <w:sz w:val="22"/>
+        </w:rPr>
+        <w:t>13.2 Compliance</w:t>
+      </w:r>
+    </w:p>
+    <w:p>
+      <w:pPr>
+        <w:spacing w:after="120"/>
+      </w:pPr>
+      <w:r>
+        <w:rPr>
+          <w:b w:val="0"/>
+          <w:sz w:val="22"/>
+        </w:rPr>
+        <w:t>The system shall comply with the Tanzania Personal Data Protection Act (2022) and with TRA records-management and confidentiality requirements. A Data Protection Impact Assessment (DPIA) should be completed before pilot go-live.</w:t>
+      </w:r>
+    </w:p>
+    <w:p>
+      <w:pPr>
         <w:rPr>
           <w:rFonts w:ascii="Times New Roman" w:hAnsi="Times New Roman" w:cs="Times New Roman"/>
           <w:b/>
@@ -8314,6 +10460,18 @@
     </w:p>
     <w:p>
       <w:pPr>
+        <w:spacing w:after="120"/>
+      </w:pPr>
+      <w:r>
+        <w:rPr>
+          <w:b w:val="0"/>
+          <w:sz w:val="22"/>
+        </w:rPr>
+        <w:t>Duration: 2–4 weeks (operate, evaluate, correct)</w:t>
+      </w:r>
+    </w:p>
+    <w:p>
+      <w:pPr>
         <w:rPr>
           <w:rFonts w:ascii="Times New Roman" w:hAnsi="Times New Roman" w:cs="Times New Roman"/>
           <w:b/>
@@ -8410,6 +10568,102 @@
     </w:p>
     <w:p>
       <w:pPr>
+        <w:spacing w:after="120"/>
+      </w:pPr>
+      <w:r>
+        <w:rPr>
+          <w:b w:val="0"/>
+          <w:sz w:val="22"/>
+        </w:rPr>
+        <w:t>Duration: 4–6 weeks after successful pilot evaluation</w:t>
+      </w:r>
+    </w:p>
+    <w:p>
+      <w:pPr>
+        <w:spacing w:after="120"/>
+      </w:pPr>
+      <w:r>
+        <w:rPr>
+          <w:b/>
+          <w:sz w:val="22"/>
+        </w:rPr>
+        <w:t>Total estimated duration</w:t>
+      </w:r>
+    </w:p>
+    <w:p>
+      <w:pPr>
+        <w:spacing w:after="120"/>
+      </w:pPr>
+      <w:r>
+        <w:rPr>
+          <w:b w:val="0"/>
+          <w:sz w:val="22"/>
+        </w:rPr>
+        <w:t>17–32 weeks from the start of Phase 1 to completion of Phase 8, including the pilot evaluation before wider rollout.</w:t>
+      </w:r>
+    </w:p>
+    <w:p>
+      <w:pPr>
+        <w:spacing w:after="120"/>
+      </w:pPr>
+      <w:r>
+        <w:rPr>
+          <w:b/>
+          <w:sz w:val="22"/>
+        </w:rPr>
+        <w:t>Key milestones</w:t>
+      </w:r>
+    </w:p>
+    <w:p>
+      <w:pPr>
+        <w:spacing w:after="120"/>
+      </w:pPr>
+      <w:r>
+        <w:rPr>
+          <w:b w:val="0"/>
+          <w:sz w:val="22"/>
+        </w:rPr>
+        <w:t>M1 – Scope and KPI baselines approved (end of Phase 1).</w:t>
+      </w:r>
+    </w:p>
+    <w:p>
+      <w:pPr>
+        <w:spacing w:after="120"/>
+      </w:pPr>
+      <w:r>
+        <w:rPr>
+          <w:b w:val="0"/>
+          <w:sz w:val="22"/>
+        </w:rPr>
+        <w:t>M2 – System built and tested (end of Phase 5).</w:t>
+      </w:r>
+    </w:p>
+    <w:p>
+      <w:pPr>
+        <w:spacing w:after="120"/>
+      </w:pPr>
+      <w:r>
+        <w:rPr>
+          <w:b w:val="0"/>
+          <w:sz w:val="22"/>
+        </w:rPr>
+        <w:t>M3 – Pilot go-live and evaluation complete (end of Phase 7).</w:t>
+      </w:r>
+    </w:p>
+    <w:p>
+      <w:pPr>
+        <w:spacing w:after="120"/>
+      </w:pPr>
+      <w:r>
+        <w:rPr>
+          <w:b w:val="0"/>
+          <w:sz w:val="22"/>
+        </w:rPr>
+        <w:t>M4 – Full implementation and sign-off (end of Phase 8).</w:t>
+      </w:r>
+    </w:p>
+    <w:p>
+      <w:pPr>
         <w:rPr>
           <w:rFonts w:ascii="Times New Roman" w:hAnsi="Times New Roman" w:cs="Times New Roman"/>
           <w:b/>
@@ -8742,6 +10996,126 @@
     </w:p>
     <w:p>
       <w:pPr>
+        <w:spacing w:after="120"/>
+      </w:pPr>
+      <w:r>
+        <w:rPr>
+          <w:b/>
+          <w:sz w:val="22"/>
+        </w:rPr>
+        <w:t>Costing assumptions</w:t>
+      </w:r>
+    </w:p>
+    <w:p>
+      <w:pPr>
+        <w:spacing w:after="120"/>
+      </w:pPr>
+      <w:r>
+        <w:rPr>
+          <w:b w:val="0"/>
+          <w:sz w:val="22"/>
+        </w:rPr>
+        <w:t>Software development (12,000,000 TZS): assumes development by TRA’s internal ICT team or a small local vendor – approximately three developers for eight to ten weeks.</w:t>
+      </w:r>
+    </w:p>
+    <w:p>
+      <w:pPr>
+        <w:spacing w:after="120"/>
+      </w:pPr>
+      <w:r>
+        <w:rPr>
+          <w:b w:val="0"/>
+          <w:sz w:val="22"/>
+        </w:rPr>
+        <w:t>Large digital display (4,000,000 TZS): one 55-inch display with wall mount, cabling and installation.</w:t>
+      </w:r>
+    </w:p>
+    <w:p>
+      <w:pPr>
+        <w:spacing w:after="120"/>
+      </w:pPr>
+      <w:r>
+        <w:rPr>
+          <w:b w:val="0"/>
+          <w:sz w:val="22"/>
+        </w:rPr>
+        <w:t>Touchscreen/kiosk (3,500,000 TZS): one interactive kiosk with mounting and power supply.</w:t>
+      </w:r>
+    </w:p>
+    <w:p>
+      <w:pPr>
+        <w:spacing w:after="120"/>
+      </w:pPr>
+      <w:r>
+        <w:rPr>
+          <w:b w:val="0"/>
+          <w:sz w:val="22"/>
+        </w:rPr>
+        <w:t>QR implementation (500,000 TZS): QR codes link to a responsive public web page; no mobile application is required.</w:t>
+      </w:r>
+    </w:p>
+    <w:p>
+      <w:pPr>
+        <w:spacing w:after="120"/>
+      </w:pPr>
+      <w:r>
+        <w:rPr>
+          <w:b w:val="0"/>
+          <w:sz w:val="22"/>
+        </w:rPr>
+        <w:t>Maintenance/contingency (4,000,000 TZS): includes a 10% contingency reserve and the first year of support.</w:t>
+      </w:r>
+    </w:p>
+    <w:p>
+      <w:pPr>
+        <w:spacing w:after="120"/>
+      </w:pPr>
+      <w:r>
+        <w:rPr>
+          <w:b/>
+          <w:sz w:val="22"/>
+        </w:rPr>
+        <w:t>Annual operating cost</w:t>
+      </w:r>
+    </w:p>
+    <w:p>
+      <w:pPr>
+        <w:spacing w:after="120"/>
+      </w:pPr>
+      <w:r>
+        <w:rPr>
+          <w:b w:val="0"/>
+          <w:sz w:val="22"/>
+        </w:rPr>
+        <w:t>An indicative recurring cost of approximately 3,500,000 TZS per year for server/cloud hosting, maintenance and technical support should be confirmed during procurement.</w:t>
+      </w:r>
+    </w:p>
+    <w:p>
+      <w:pPr>
+        <w:spacing w:after="120"/>
+      </w:pPr>
+      <w:r>
+        <w:rPr>
+          <w:b/>
+          <w:sz w:val="22"/>
+        </w:rPr>
+        <w:t>Build versus buy</w:t>
+      </w:r>
+    </w:p>
+    <w:p>
+      <w:pPr>
+        <w:spacing w:after="120"/>
+      </w:pPr>
+      <w:r>
+        <w:rPr>
+          <w:b w:val="0"/>
+          <w:sz w:val="22"/>
+        </w:rPr>
+        <w:t>A formal build-versus-buy comparison against a licensed Document Management System should be carried out in Phase 2; the estimates above assume internal (in-house) development.</w:t>
+      </w:r>
+    </w:p>
+    <w:p>
+      <w:pPr>
         <w:rPr>
           <w:rFonts w:ascii="Times New Roman" w:hAnsi="Times New Roman" w:cs="Times New Roman"/>
         </w:rPr>
@@ -9463,6 +11837,634 @@
     </w:p>
     <w:p>
       <w:pPr>
+        <w:spacing w:after="120"/>
+      </w:pPr>
+      <w:r>
+        <w:rPr>
+          <w:b/>
+          <w:sz w:val="22"/>
+        </w:rPr>
+        <w:t>19.1 Measurable Targets (draft)</w:t>
+      </w:r>
+    </w:p>
+    <w:p>
+      <w:pPr>
+        <w:spacing w:after="120"/>
+      </w:pPr>
+      <w:r>
+        <w:rPr>
+          <w:b w:val="0"/>
+          <w:sz w:val="22"/>
+        </w:rPr>
+        <w:t>The draft targets below will be finalized using baseline values collected during the Phase 1 baseline study:</w:t>
+      </w:r>
+    </w:p>
+    <w:tbl>
+      <w:tblPr>
+        <w:tblW w:type="auto" w:w="0"/>
+        <w:tblLook w:firstColumn="1" w:firstRow="1" w:lastColumn="0" w:lastRow="0" w:noHBand="0" w:noVBand="1" w:val="04A0"/>
+        <w:tblBorders>
+          <w:top w:val="single" w:sz="4" w:space="0" w:color="000000"/>
+          <w:left w:val="single" w:sz="4" w:space="0" w:color="000000"/>
+          <w:bottom w:val="single" w:sz="4" w:space="0" w:color="000000"/>
+          <w:right w:val="single" w:sz="4" w:space="0" w:color="000000"/>
+          <w:insideH w:val="single" w:sz="4" w:space="0" w:color="000000"/>
+          <w:insideV w:val="single" w:sz="4" w:space="0" w:color="000000"/>
+        </w:tblBorders>
+      </w:tblPr>
+      <w:tblGrid>
+        <w:gridCol w:w="2340"/>
+        <w:gridCol w:w="2340"/>
+        <w:gridCol w:w="2340"/>
+        <w:gridCol w:w="2340"/>
+      </w:tblGrid>
+      <w:tr>
+        <w:tc>
+          <w:tcPr>
+            <w:tcW w:type="dxa" w:w="2340"/>
+          </w:tcPr>
+          <w:p>
+            <w:r/>
+            <w:r>
+              <w:rPr>
+                <w:b/>
+                <w:sz w:val="20"/>
+              </w:rPr>
+              <w:t>KPI</w:t>
+            </w:r>
+          </w:p>
+        </w:tc>
+        <w:tc>
+          <w:tcPr>
+            <w:tcW w:type="dxa" w:w="2340"/>
+          </w:tcPr>
+          <w:p>
+            <w:r/>
+            <w:r>
+              <w:rPr>
+                <w:b/>
+                <w:sz w:val="20"/>
+              </w:rPr>
+              <w:t>Baseline (from Phase 1 study)</w:t>
+            </w:r>
+          </w:p>
+        </w:tc>
+        <w:tc>
+          <w:tcPr>
+            <w:tcW w:type="dxa" w:w="2340"/>
+          </w:tcPr>
+          <w:p>
+            <w:r/>
+            <w:r>
+              <w:rPr>
+                <w:b/>
+                <w:sz w:val="20"/>
+              </w:rPr>
+              <w:t>Target (6 months after go-live)</w:t>
+            </w:r>
+          </w:p>
+        </w:tc>
+        <w:tc>
+          <w:tcPr>
+            <w:tcW w:type="dxa" w:w="2340"/>
+          </w:tcPr>
+          <w:p>
+            <w:r/>
+            <w:r>
+              <w:rPr>
+                <w:b/>
+                <w:sz w:val="20"/>
+              </w:rPr>
+              <w:t>How it is measured</w:t>
+            </w:r>
+          </w:p>
+        </w:tc>
+      </w:tr>
+      <w:tr>
+        <w:tc>
+          <w:tcPr>
+            <w:tcW w:type="dxa" w:w="2340"/>
+          </w:tcPr>
+          <w:p>
+            <w:r/>
+            <w:r>
+              <w:rPr>
+                <w:sz w:val="20"/>
+              </w:rPr>
+              <w:t>Document registration time</w:t>
+            </w:r>
+          </w:p>
+        </w:tc>
+        <w:tc>
+          <w:tcPr>
+            <w:tcW w:type="dxa" w:w="2340"/>
+          </w:tcPr>
+          <w:p>
+            <w:r/>
+            <w:r>
+              <w:rPr>
+                <w:sz w:val="20"/>
+              </w:rPr>
+              <w:t>To be confirmed</w:t>
+            </w:r>
+          </w:p>
+        </w:tc>
+        <w:tc>
+          <w:tcPr>
+            <w:tcW w:type="dxa" w:w="2340"/>
+          </w:tcPr>
+          <w:p>
+            <w:r/>
+            <w:r>
+              <w:rPr>
+                <w:sz w:val="20"/>
+              </w:rPr>
+              <w:t>75% reduction from baseline</w:t>
+            </w:r>
+          </w:p>
+        </w:tc>
+        <w:tc>
+          <w:tcPr>
+            <w:tcW w:type="dxa" w:w="2340"/>
+          </w:tcPr>
+          <w:p>
+            <w:r/>
+            <w:r>
+              <w:rPr>
+                <w:sz w:val="20"/>
+              </w:rPr>
+              <w:t>System registration timestamp</w:t>
+            </w:r>
+          </w:p>
+        </w:tc>
+      </w:tr>
+      <w:tr>
+        <w:tc>
+          <w:tcPr>
+            <w:tcW w:type="dxa" w:w="2340"/>
+          </w:tcPr>
+          <w:p>
+            <w:r/>
+            <w:r>
+              <w:rPr>
+                <w:sz w:val="20"/>
+              </w:rPr>
+              <w:t>File retrieval time</w:t>
+            </w:r>
+          </w:p>
+        </w:tc>
+        <w:tc>
+          <w:tcPr>
+            <w:tcW w:type="dxa" w:w="2340"/>
+          </w:tcPr>
+          <w:p>
+            <w:r/>
+            <w:r>
+              <w:rPr>
+                <w:sz w:val="20"/>
+              </w:rPr>
+              <w:t>To be confirmed</w:t>
+            </w:r>
+          </w:p>
+        </w:tc>
+        <w:tc>
+          <w:tcPr>
+            <w:tcW w:type="dxa" w:w="2340"/>
+          </w:tcPr>
+          <w:p>
+            <w:r/>
+            <w:r>
+              <w:rPr>
+                <w:sz w:val="20"/>
+              </w:rPr>
+              <w:t>Average ≤ 3 minutes</w:t>
+            </w:r>
+          </w:p>
+        </w:tc>
+        <w:tc>
+          <w:tcPr>
+            <w:tcW w:type="dxa" w:w="2340"/>
+          </w:tcPr>
+          <w:p>
+            <w:r/>
+            <w:r>
+              <w:rPr>
+                <w:sz w:val="20"/>
+              </w:rPr>
+              <w:t>Search/retrieval session time</w:t>
+            </w:r>
+          </w:p>
+        </w:tc>
+      </w:tr>
+      <w:tr>
+        <w:tc>
+          <w:tcPr>
+            <w:tcW w:type="dxa" w:w="2340"/>
+          </w:tcPr>
+          <w:p>
+            <w:r/>
+            <w:r>
+              <w:rPr>
+                <w:sz w:val="20"/>
+              </w:rPr>
+              <w:t>Lost/misplaced files</w:t>
+            </w:r>
+          </w:p>
+        </w:tc>
+        <w:tc>
+          <w:tcPr>
+            <w:tcW w:type="dxa" w:w="2340"/>
+          </w:tcPr>
+          <w:p>
+            <w:r/>
+            <w:r>
+              <w:rPr>
+                <w:sz w:val="20"/>
+              </w:rPr>
+              <w:t>To be confirmed</w:t>
+            </w:r>
+          </w:p>
+        </w:tc>
+        <w:tc>
+          <w:tcPr>
+            <w:tcW w:type="dxa" w:w="2340"/>
+          </w:tcPr>
+          <w:p>
+            <w:r/>
+            <w:r>
+              <w:rPr>
+                <w:sz w:val="20"/>
+              </w:rPr>
+              <w:t>0 movements unaccounted</w:t>
+            </w:r>
+          </w:p>
+        </w:tc>
+        <w:tc>
+          <w:tcPr>
+            <w:tcW w:type="dxa" w:w="2340"/>
+          </w:tcPr>
+          <w:p>
+            <w:r/>
+            <w:r>
+              <w:rPr>
+                <w:sz w:val="20"/>
+              </w:rPr>
+              <w:t>Movement log reconciliation</w:t>
+            </w:r>
+          </w:p>
+        </w:tc>
+      </w:tr>
+      <w:tr>
+        <w:tc>
+          <w:tcPr>
+            <w:tcW w:type="dxa" w:w="2340"/>
+          </w:tcPr>
+          <w:p>
+            <w:r/>
+            <w:r>
+              <w:rPr>
+                <w:sz w:val="20"/>
+              </w:rPr>
+              <w:t>Visitor direction inquiries</w:t>
+            </w:r>
+          </w:p>
+        </w:tc>
+        <w:tc>
+          <w:tcPr>
+            <w:tcW w:type="dxa" w:w="2340"/>
+          </w:tcPr>
+          <w:p>
+            <w:r/>
+            <w:r>
+              <w:rPr>
+                <w:sz w:val="20"/>
+              </w:rPr>
+              <w:t>To be confirmed</w:t>
+            </w:r>
+          </w:p>
+        </w:tc>
+        <w:tc>
+          <w:tcPr>
+            <w:tcW w:type="dxa" w:w="2340"/>
+          </w:tcPr>
+          <w:p>
+            <w:r/>
+            <w:r>
+              <w:rPr>
+                <w:sz w:val="20"/>
+              </w:rPr>
+              <w:t>50% reduction from baseline</w:t>
+            </w:r>
+          </w:p>
+        </w:tc>
+        <w:tc>
+          <w:tcPr>
+            <w:tcW w:type="dxa" w:w="2340"/>
+          </w:tcPr>
+          <w:p>
+            <w:r/>
+            <w:r>
+              <w:rPr>
+                <w:sz w:val="20"/>
+              </w:rPr>
+              <w:t>Reception daily tally</w:t>
+            </w:r>
+          </w:p>
+        </w:tc>
+      </w:tr>
+      <w:tr>
+        <w:tc>
+          <w:tcPr>
+            <w:tcW w:type="dxa" w:w="2340"/>
+          </w:tcPr>
+          <w:p>
+            <w:r/>
+            <w:r>
+              <w:rPr>
+                <w:sz w:val="20"/>
+              </w:rPr>
+              <w:t>Digital documents</w:t>
+            </w:r>
+          </w:p>
+        </w:tc>
+        <w:tc>
+          <w:tcPr>
+            <w:tcW w:type="dxa" w:w="2340"/>
+          </w:tcPr>
+          <w:p>
+            <w:r/>
+            <w:r>
+              <w:rPr>
+                <w:sz w:val="20"/>
+              </w:rPr>
+              <w:t>To be confirmed</w:t>
+            </w:r>
+          </w:p>
+        </w:tc>
+        <w:tc>
+          <w:tcPr>
+            <w:tcW w:type="dxa" w:w="2340"/>
+          </w:tcPr>
+          <w:p>
+            <w:r/>
+            <w:r>
+              <w:rPr>
+                <w:sz w:val="20"/>
+              </w:rPr>
+              <w:t>≥ 70% of new correspondence digitized</w:t>
+            </w:r>
+          </w:p>
+        </w:tc>
+        <w:tc>
+          <w:tcPr>
+            <w:tcW w:type="dxa" w:w="2340"/>
+          </w:tcPr>
+          <w:p>
+            <w:r/>
+            <w:r>
+              <w:rPr>
+                <w:sz w:val="20"/>
+              </w:rPr>
+              <w:t>Document database count</w:t>
+            </w:r>
+          </w:p>
+        </w:tc>
+      </w:tr>
+      <w:tr>
+        <w:tc>
+          <w:tcPr>
+            <w:tcW w:type="dxa" w:w="2340"/>
+          </w:tcPr>
+          <w:p>
+            <w:r/>
+            <w:r>
+              <w:rPr>
+                <w:sz w:val="20"/>
+              </w:rPr>
+              <w:t>File tracking coverage</w:t>
+            </w:r>
+          </w:p>
+        </w:tc>
+        <w:tc>
+          <w:tcPr>
+            <w:tcW w:type="dxa" w:w="2340"/>
+          </w:tcPr>
+          <w:p>
+            <w:r/>
+            <w:r>
+              <w:rPr>
+                <w:sz w:val="20"/>
+              </w:rPr>
+              <w:t>0%</w:t>
+            </w:r>
+          </w:p>
+        </w:tc>
+        <w:tc>
+          <w:tcPr>
+            <w:tcW w:type="dxa" w:w="2340"/>
+          </w:tcPr>
+          <w:p>
+            <w:r/>
+            <w:r>
+              <w:rPr>
+                <w:sz w:val="20"/>
+              </w:rPr>
+              <w:t>100% of registered movements</w:t>
+            </w:r>
+          </w:p>
+        </w:tc>
+        <w:tc>
+          <w:tcPr>
+            <w:tcW w:type="dxa" w:w="2340"/>
+          </w:tcPr>
+          <w:p>
+            <w:r/>
+            <w:r>
+              <w:rPr>
+                <w:sz w:val="20"/>
+              </w:rPr>
+              <w:t>Audit log</w:t>
+            </w:r>
+          </w:p>
+        </w:tc>
+      </w:tr>
+      <w:tr>
+        <w:tc>
+          <w:tcPr>
+            <w:tcW w:type="dxa" w:w="2340"/>
+          </w:tcPr>
+          <w:p>
+            <w:r/>
+            <w:r>
+              <w:rPr>
+                <w:sz w:val="20"/>
+              </w:rPr>
+              <w:t>System availability</w:t>
+            </w:r>
+          </w:p>
+        </w:tc>
+        <w:tc>
+          <w:tcPr>
+            <w:tcW w:type="dxa" w:w="2340"/>
+          </w:tcPr>
+          <w:p>
+            <w:r/>
+            <w:r>
+              <w:rPr>
+                <w:sz w:val="20"/>
+              </w:rPr>
+              <w:t>N/A</w:t>
+            </w:r>
+          </w:p>
+        </w:tc>
+        <w:tc>
+          <w:tcPr>
+            <w:tcW w:type="dxa" w:w="2340"/>
+          </w:tcPr>
+          <w:p>
+            <w:r/>
+            <w:r>
+              <w:rPr>
+                <w:sz w:val="20"/>
+              </w:rPr>
+              <w:t>≥ 99%</w:t>
+            </w:r>
+          </w:p>
+        </w:tc>
+        <w:tc>
+          <w:tcPr>
+            <w:tcW w:type="dxa" w:w="2340"/>
+          </w:tcPr>
+          <w:p>
+            <w:r/>
+            <w:r>
+              <w:rPr>
+                <w:sz w:val="20"/>
+              </w:rPr>
+              <w:t>Uptime monitoring</w:t>
+            </w:r>
+          </w:p>
+        </w:tc>
+      </w:tr>
+      <w:tr>
+        <w:tc>
+          <w:tcPr>
+            <w:tcW w:type="dxa" w:w="2340"/>
+          </w:tcPr>
+          <w:p>
+            <w:r/>
+            <w:r>
+              <w:rPr>
+                <w:sz w:val="20"/>
+              </w:rPr>
+              <w:t>User adoption</w:t>
+            </w:r>
+          </w:p>
+        </w:tc>
+        <w:tc>
+          <w:tcPr>
+            <w:tcW w:type="dxa" w:w="2340"/>
+          </w:tcPr>
+          <w:p>
+            <w:r/>
+            <w:r>
+              <w:rPr>
+                <w:sz w:val="20"/>
+              </w:rPr>
+              <w:t>0%</w:t>
+            </w:r>
+          </w:p>
+        </w:tc>
+        <w:tc>
+          <w:tcPr>
+            <w:tcW w:type="dxa" w:w="2340"/>
+          </w:tcPr>
+          <w:p>
+            <w:r/>
+            <w:r>
+              <w:rPr>
+                <w:sz w:val="20"/>
+              </w:rPr>
+              <w:t>≥ 90% of trained staff active weekly</w:t>
+            </w:r>
+          </w:p>
+        </w:tc>
+        <w:tc>
+          <w:tcPr>
+            <w:tcW w:type="dxa" w:w="2340"/>
+          </w:tcPr>
+          <w:p>
+            <w:r/>
+            <w:r>
+              <w:rPr>
+                <w:sz w:val="20"/>
+              </w:rPr>
+              <w:t>Login/activity statistics</w:t>
+            </w:r>
+          </w:p>
+        </w:tc>
+      </w:tr>
+      <w:tr>
+        <w:tc>
+          <w:tcPr>
+            <w:tcW w:type="dxa" w:w="2340"/>
+          </w:tcPr>
+          <w:p>
+            <w:r/>
+            <w:r>
+              <w:rPr>
+                <w:sz w:val="20"/>
+              </w:rPr>
+              <w:t>Visitor satisfaction</w:t>
+            </w:r>
+          </w:p>
+        </w:tc>
+        <w:tc>
+          <w:tcPr>
+            <w:tcW w:type="dxa" w:w="2340"/>
+          </w:tcPr>
+          <w:p>
+            <w:r/>
+            <w:r>
+              <w:rPr>
+                <w:sz w:val="20"/>
+              </w:rPr>
+              <w:t>To be confirmed</w:t>
+            </w:r>
+          </w:p>
+        </w:tc>
+        <w:tc>
+          <w:tcPr>
+            <w:tcW w:type="dxa" w:w="2340"/>
+          </w:tcPr>
+          <w:p>
+            <w:r/>
+            <w:r>
+              <w:rPr>
+                <w:sz w:val="20"/>
+              </w:rPr>
+              <w:t>≥ 4.0 out of 5.0</w:t>
+            </w:r>
+          </w:p>
+        </w:tc>
+        <w:tc>
+          <w:tcPr>
+            <w:tcW w:type="dxa" w:w="2340"/>
+          </w:tcPr>
+          <w:p>
+            <w:r/>
+            <w:r>
+              <w:rPr>
+                <w:sz w:val="20"/>
+              </w:rPr>
+              <w:t>Quarterly visitor survey</w:t>
+            </w:r>
+          </w:p>
+        </w:tc>
+      </w:tr>
+    </w:tbl>
+    <w:p>
+      <w:pPr>
         <w:rPr>
           <w:rFonts w:ascii="Times New Roman" w:hAnsi="Times New Roman" w:cs="Times New Roman"/>
         </w:rPr>
@@ -9926,6 +12928,101 @@
           <w:color w:val="002060"/>
         </w:rPr>
         <w:t>“From Manual Registry to Smart Digital Registry and Guided Service.”</w:t>
+      </w:r>
+    </w:p>
+    <w:p>
+      <w:pPr>
+        <w:spacing w:after="120"/>
+      </w:pPr>
+      <w:r>
+        <w:rPr>
+          <w:b/>
+          <w:sz w:val="22"/>
+        </w:rPr>
+        <w:t>Project governance and next steps</w:t>
+      </w:r>
+    </w:p>
+    <w:p>
+      <w:pPr>
+        <w:spacing w:after="120"/>
+      </w:pPr>
+      <w:r>
+        <w:rPr>
+          <w:b w:val="0"/>
+          <w:sz w:val="22"/>
+        </w:rPr>
+        <w:t>Proposed project sponsor: Director of the TRA unit responsible for Registry/Records Management.</w:t>
+      </w:r>
+    </w:p>
+    <w:p>
+      <w:pPr>
+        <w:spacing w:after="120"/>
+      </w:pPr>
+      <w:r>
+        <w:rPr>
+          <w:b w:val="0"/>
+          <w:sz w:val="22"/>
+        </w:rPr>
+        <w:t>Proposed project owner: Registry/Records function supported by the ICT department.</w:t>
+      </w:r>
+    </w:p>
+    <w:p>
+      <w:pPr>
+        <w:spacing w:after="120"/>
+      </w:pPr>
+      <w:r>
+        <w:rPr>
+          <w:b w:val="0"/>
+          <w:sz w:val="22"/>
+        </w:rPr>
+        <w:t>Next step 1 – Management approval of this proposal.</w:t>
+      </w:r>
+    </w:p>
+    <w:p>
+      <w:pPr>
+        <w:spacing w:after="120"/>
+      </w:pPr>
+      <w:r>
+        <w:rPr>
+          <w:b w:val="0"/>
+          <w:sz w:val="22"/>
+        </w:rPr>
+        <w:t>Next step 2 – Baseline study to finalize KPI targets (Phase 1).</w:t>
+      </w:r>
+    </w:p>
+    <w:p>
+      <w:pPr>
+        <w:spacing w:after="120"/>
+      </w:pPr>
+      <w:r>
+        <w:rPr>
+          <w:b w:val="0"/>
+          <w:sz w:val="22"/>
+        </w:rPr>
+        <w:t>Next step 3 – Go/no-go approval of the pilot after Phase 5 testing.</w:t>
+      </w:r>
+    </w:p>
+    <w:p>
+      <w:pPr>
+        <w:spacing w:after="120"/>
+      </w:pPr>
+      <w:r>
+        <w:rPr>
+          <w:b w:val="0"/>
+          <w:sz w:val="22"/>
+        </w:rPr>
+      </w:r>
+    </w:p>
+    <w:p>
+      <w:pPr>
+        <w:spacing w:after="120"/>
+      </w:pPr>
+      <w:r>
+        <w:rPr>
+          <w:b w:val="0"/>
+          <w:sz w:val="22"/>
+        </w:rPr>
+        <w:t>Approved by: _______________________________    Signature: _________________________    Date: ______________________</w:t>
       </w:r>
     </w:p>
     <w:sectPr>

</xml_diff>